<commit_message>
Tambah pembayaran cicilan sebagian dan perbaikan pembulatan cicilan
</commit_message>
<xml_diff>
--- a/server/src/templates/Template_Struk_Primaboga.docx
+++ b/server/src/templates/Template_Struk_Primaboga.docx
@@ -1877,7 +1877,7 @@
                 <w:sz w:val="18"/>
                 <w:szCs w:val="18"/>
               </w:rPr>
-              <w:t xml:space="preserve">Sisa Cicilan</w:t>
+              <w:t xml:space="preserve">Sisa Piutang</w:t>
             </w:r>
           </w:p>
         </w:tc>
@@ -2102,6 +2102,60 @@
         </w:tc>
       </w:tr>
     </w:tbl>
+    <w:p>
+      <w:pPr>
+        <w:spacing w:after="40" w:before="80"/>
+        <w:jc w:val="right"/>
+      </w:pPr>
+      <w:r>
+        <w:rPr>
+          <w:rFonts w:ascii="Arial" w:cs="Arial" w:eastAsia="Arial" w:hAnsi="Arial"/>
+          <w:b w:val="false"/>
+          <w:bCs w:val="false"/>
+          <w:i w:val="false"/>
+          <w:iCs w:val="false"/>
+          <w:sz w:val="18"/>
+          <w:szCs w:val="18"/>
+        </w:rPr>
+        <w:t xml:space="preserve">Total terbayar sampai saat ini : </w:t>
+      </w:r>
+      <w:r>
+        <w:rPr>
+          <w:rFonts w:ascii="Arial" w:cs="Arial" w:eastAsia="Arial" w:hAnsi="Arial"/>
+          <w:b/>
+          <w:bCs/>
+          <w:i w:val="false"/>
+          <w:iCs w:val="false"/>
+          <w:sz w:val="18"/>
+          <w:szCs w:val="18"/>
+        </w:rPr>
+        <w:t xml:space="preserve">{total_terbayar}</w:t>
+      </w:r>
+      <w:r>
+        <w:rPr>
+          <w:rFonts w:ascii="Arial" w:cs="Arial" w:eastAsia="Arial" w:hAnsi="Arial"/>
+          <w:b w:val="false"/>
+          <w:bCs w:val="false"/>
+          <w:i w:val="false"/>
+          <w:iCs w:val="false"/>
+          <w:sz w:val="18"/>
+          <w:szCs w:val="18"/>
+        </w:rPr>
+        <w:t xml:space="preserve">      Tunggakan : </w:t>
+      </w:r>
+      <w:r>
+        <w:rPr>
+          <w:rFonts w:ascii="Arial" w:cs="Arial" w:eastAsia="Arial" w:hAnsi="Arial"/>
+          <w:b/>
+          <w:bCs/>
+          <w:i w:val="false"/>
+          <w:iCs w:val="false"/>
+          <w:sz w:val="18"/>
+          <w:szCs w:val="18"/>
+        </w:rPr>
+        <w:t xml:space="preserve">{tunggakan}</w:t>
+      </w:r>
+    </w:p>
     <w:p>
       <w:pPr>
         <w:spacing w:after="40" w:before="0"/>

</xml_diff>